<commit_message>
Simulador SIAFI refeito só com o terminal, seguindo os manuais
- tela de login e seleção da Unidade Executora
- UO informada nas janelas, como no sistema
- apropriação com histórico padrão, histórico de referência,
  confirmação e envio para assinatura digital
- liquidação com conformidade, competência, data prevista,
  eventos de retenção e detalhamento por credor da retenção
- reforço, consultas de empenho e liquidação
- ordem de pagamento por credor com conta única ou outro banco,
  IRRF retido no pagamento e resumo global
- especificações em Word atualizadas para os novos campos

Co-Authored-By: Claude Opus 5.5 <noreply@anthropic.com>
Claude-Session: https://claude.ai/code/session_017WkAoUekkvr4DuFbwx2atn
</commit_message>
<xml_diff>
--- a/treinamento-siafi/Especificacoes_de_Empenho_Impressao.docx
+++ b/treinamento-siafi/Especificacoes_de_Empenho_Impressao.docx
@@ -152,7 +152,7 @@
                 <w:sz w:val="18"/>
                 <w:szCs w:val="18"/>
               </w:rPr>
-              <w:t xml:space="preserve">Processo SIAD</w:t>
+              <w:t xml:space="preserve">Processo SIAD (Un/Seq/Ano)</w:t>
             </w:r>
           </w:p>
         </w:tc>
@@ -184,7 +184,7 @@
                 <w:sz w:val="18"/>
                 <w:szCs w:val="18"/>
               </w:rPr>
-              <w:t xml:space="preserve">50057/412/2026</w:t>
+              <w:t xml:space="preserve">1250057 412 2026</w:t>
             </w:r>
           </w:p>
         </w:tc>
@@ -1129,7 +1129,7 @@
                 <w:sz w:val="18"/>
                 <w:szCs w:val="18"/>
               </w:rPr>
-              <w:t xml:space="preserve">50057</w:t>
+              <w:t xml:space="preserve">1250057</w:t>
             </w:r>
           </w:p>
         </w:tc>
@@ -1196,7 +1196,7 @@
                 <w:sz w:val="18"/>
                 <w:szCs w:val="18"/>
               </w:rPr>
-              <w:t xml:space="preserve">06.181.701.2001</w:t>
+              <w:t xml:space="preserve">06 181 701 2001 0001</w:t>
             </w:r>
           </w:p>
         </w:tc>
@@ -1229,7 +1229,7 @@
                 <w:sz w:val="18"/>
                 <w:szCs w:val="18"/>
               </w:rPr>
-              <w:t xml:space="preserve">Fonte</w:t>
+              <w:t xml:space="preserve">Fonte / Proc. / IPE</w:t>
             </w:r>
           </w:p>
         </w:tc>
@@ -1261,7 +1261,7 @@
                 <w:sz w:val="18"/>
                 <w:szCs w:val="18"/>
               </w:rPr>
-              <w:t xml:space="preserve">6020</w:t>
+              <w:t xml:space="preserve">6020 / 1 / 0</w:t>
             </w:r>
           </w:p>
         </w:tc>
@@ -3132,6 +3132,338 @@
                 <w:szCs w:val="18"/>
               </w:rPr>
               <w:t xml:space="preserve">S</w:t>
+            </w:r>
+          </w:p>
+        </w:tc>
+      </w:tr>
+      <w:tr>
+        <w:tc>
+          <w:tcPr>
+            <w:tcW w:type="dxa" w:w="2000"/>
+            <w:tcBorders>
+              <w:top w:val="single" w:color="9AA8B8" w:sz="4"/>
+              <w:left w:val="single" w:color="9AA8B8" w:sz="4"/>
+              <w:bottom w:val="single" w:color="9AA8B8" w:sz="4"/>
+              <w:right w:val="single" w:color="9AA8B8" w:sz="4"/>
+            </w:tcBorders>
+            <w:shd w:fill="E8EDF3" w:color="auto" w:val="clear"/>
+            <w:tcMar>
+              <w:top w:type="dxa" w:w="35"/>
+              <w:left w:type="dxa" w:w="90"/>
+              <w:bottom w:type="dxa" w:w="35"/>
+              <w:right w:type="dxa" w:w="90"/>
+            </w:tcMar>
+          </w:tcPr>
+          <w:p>
+            <w:pPr>
+              <w:jc w:val="left"/>
+            </w:pPr>
+            <w:r>
+              <w:rPr>
+                <w:rFonts w:ascii="Arial" w:cs="Arial" w:eastAsia="Arial" w:hAnsi="Arial"/>
+                <w:b/>
+                <w:bCs/>
+                <w:sz w:val="18"/>
+                <w:szCs w:val="18"/>
+              </w:rPr>
+              <w:t xml:space="preserve">Conformidade de liquidação</w:t>
+            </w:r>
+          </w:p>
+        </w:tc>
+        <w:tc>
+          <w:tcPr>
+            <w:tcW w:type="dxa" w:w="2819"/>
+            <w:tcBorders>
+              <w:top w:val="single" w:color="9AA8B8" w:sz="4"/>
+              <w:left w:val="single" w:color="9AA8B8" w:sz="4"/>
+              <w:bottom w:val="single" w:color="9AA8B8" w:sz="4"/>
+              <w:right w:val="single" w:color="9AA8B8" w:sz="4"/>
+            </w:tcBorders>
+            <w:tcMar>
+              <w:top w:type="dxa" w:w="35"/>
+              <w:left w:type="dxa" w:w="90"/>
+              <w:bottom w:type="dxa" w:w="35"/>
+              <w:right w:type="dxa" w:w="90"/>
+            </w:tcMar>
+          </w:tcPr>
+          <w:p>
+            <w:pPr>
+              <w:jc w:val="left"/>
+            </w:pPr>
+            <w:r>
+              <w:rPr>
+                <w:rFonts w:ascii="Arial" w:cs="Arial" w:eastAsia="Arial" w:hAnsi="Arial"/>
+                <w:b w:val="false"/>
+                <w:bCs w:val="false"/>
+                <w:sz w:val="18"/>
+                <w:szCs w:val="18"/>
+              </w:rPr>
+              <w:t xml:space="preserve">1250057 501 2026</w:t>
+            </w:r>
+          </w:p>
+        </w:tc>
+        <w:tc>
+          <w:tcPr>
+            <w:tcW w:type="dxa" w:w="2000"/>
+            <w:tcBorders>
+              <w:top w:val="single" w:color="9AA8B8" w:sz="4"/>
+              <w:left w:val="single" w:color="9AA8B8" w:sz="4"/>
+              <w:bottom w:val="single" w:color="9AA8B8" w:sz="4"/>
+              <w:right w:val="single" w:color="9AA8B8" w:sz="4"/>
+            </w:tcBorders>
+            <w:shd w:fill="E8EDF3" w:color="auto" w:val="clear"/>
+            <w:tcMar>
+              <w:top w:type="dxa" w:w="35"/>
+              <w:left w:type="dxa" w:w="90"/>
+              <w:bottom w:type="dxa" w:w="35"/>
+              <w:right w:type="dxa" w:w="90"/>
+            </w:tcMar>
+          </w:tcPr>
+          <w:p>
+            <w:pPr>
+              <w:jc w:val="left"/>
+            </w:pPr>
+            <w:r>
+              <w:rPr>
+                <w:rFonts w:ascii="Arial" w:cs="Arial" w:eastAsia="Arial" w:hAnsi="Arial"/>
+                <w:b/>
+                <w:bCs/>
+                <w:sz w:val="18"/>
+                <w:szCs w:val="18"/>
+              </w:rPr>
+              <w:t xml:space="preserve">Nr. Conf. SIAD</w:t>
+            </w:r>
+          </w:p>
+        </w:tc>
+        <w:tc>
+          <w:tcPr>
+            <w:tcW w:type="dxa" w:w="2819"/>
+            <w:tcBorders>
+              <w:top w:val="single" w:color="9AA8B8" w:sz="4"/>
+              <w:left w:val="single" w:color="9AA8B8" w:sz="4"/>
+              <w:bottom w:val="single" w:color="9AA8B8" w:sz="4"/>
+              <w:right w:val="single" w:color="9AA8B8" w:sz="4"/>
+            </w:tcBorders>
+            <w:tcMar>
+              <w:top w:type="dxa" w:w="35"/>
+              <w:left w:type="dxa" w:w="90"/>
+              <w:bottom w:type="dxa" w:w="35"/>
+              <w:right w:type="dxa" w:w="90"/>
+            </w:tcMar>
+          </w:tcPr>
+          <w:p>
+            <w:pPr>
+              <w:jc w:val="left"/>
+            </w:pPr>
+            <w:r>
+              <w:rPr>
+                <w:rFonts w:ascii="Arial" w:cs="Arial" w:eastAsia="Arial" w:hAnsi="Arial"/>
+                <w:b w:val="false"/>
+                <w:bCs w:val="false"/>
+                <w:sz w:val="18"/>
+                <w:szCs w:val="18"/>
+              </w:rPr>
+              <w:t xml:space="preserve">1</w:t>
+            </w:r>
+          </w:p>
+        </w:tc>
+      </w:tr>
+      <w:tr>
+        <w:tc>
+          <w:tcPr>
+            <w:tcW w:type="dxa" w:w="2000"/>
+            <w:tcBorders>
+              <w:top w:val="single" w:color="9AA8B8" w:sz="4"/>
+              <w:left w:val="single" w:color="9AA8B8" w:sz="4"/>
+              <w:bottom w:val="single" w:color="9AA8B8" w:sz="4"/>
+              <w:right w:val="single" w:color="9AA8B8" w:sz="4"/>
+            </w:tcBorders>
+            <w:shd w:fill="E8EDF3" w:color="auto" w:val="clear"/>
+            <w:tcMar>
+              <w:top w:type="dxa" w:w="35"/>
+              <w:left w:type="dxa" w:w="90"/>
+              <w:bottom w:type="dxa" w:w="35"/>
+              <w:right w:type="dxa" w:w="90"/>
+            </w:tcMar>
+          </w:tcPr>
+          <w:p>
+            <w:pPr>
+              <w:jc w:val="left"/>
+            </w:pPr>
+            <w:r>
+              <w:rPr>
+                <w:rFonts w:ascii="Arial" w:cs="Arial" w:eastAsia="Arial" w:hAnsi="Arial"/>
+                <w:b/>
+                <w:bCs/>
+                <w:sz w:val="18"/>
+                <w:szCs w:val="18"/>
+              </w:rPr>
+              <w:t xml:space="preserve">Competência</w:t>
+            </w:r>
+          </w:p>
+        </w:tc>
+        <w:tc>
+          <w:tcPr>
+            <w:tcW w:type="dxa" w:w="2819"/>
+            <w:tcBorders>
+              <w:top w:val="single" w:color="9AA8B8" w:sz="4"/>
+              <w:left w:val="single" w:color="9AA8B8" w:sz="4"/>
+              <w:bottom w:val="single" w:color="9AA8B8" w:sz="4"/>
+              <w:right w:val="single" w:color="9AA8B8" w:sz="4"/>
+            </w:tcBorders>
+            <w:tcMar>
+              <w:top w:type="dxa" w:w="35"/>
+              <w:left w:type="dxa" w:w="90"/>
+              <w:bottom w:type="dxa" w:w="35"/>
+              <w:right w:type="dxa" w:w="90"/>
+            </w:tcMar>
+          </w:tcPr>
+          <w:p>
+            <w:pPr>
+              <w:jc w:val="left"/>
+            </w:pPr>
+            <w:r>
+              <w:rPr>
+                <w:rFonts w:ascii="Arial" w:cs="Arial" w:eastAsia="Arial" w:hAnsi="Arial"/>
+                <w:b w:val="false"/>
+                <w:bCs w:val="false"/>
+                <w:sz w:val="18"/>
+                <w:szCs w:val="18"/>
+              </w:rPr>
+              <w:t xml:space="preserve">2026 / 10</w:t>
+            </w:r>
+          </w:p>
+        </w:tc>
+        <w:tc>
+          <w:tcPr>
+            <w:tcW w:type="dxa" w:w="2000"/>
+            <w:tcBorders>
+              <w:top w:val="single" w:color="9AA8B8" w:sz="4"/>
+              <w:left w:val="single" w:color="9AA8B8" w:sz="4"/>
+              <w:bottom w:val="single" w:color="9AA8B8" w:sz="4"/>
+              <w:right w:val="single" w:color="9AA8B8" w:sz="4"/>
+            </w:tcBorders>
+            <w:shd w:fill="E8EDF3" w:color="auto" w:val="clear"/>
+            <w:tcMar>
+              <w:top w:type="dxa" w:w="35"/>
+              <w:left w:type="dxa" w:w="90"/>
+              <w:bottom w:type="dxa" w:w="35"/>
+              <w:right w:type="dxa" w:w="90"/>
+            </w:tcMar>
+          </w:tcPr>
+          <w:p>
+            <w:pPr>
+              <w:jc w:val="left"/>
+            </w:pPr>
+            <w:r>
+              <w:rPr>
+                <w:rFonts w:ascii="Arial" w:cs="Arial" w:eastAsia="Arial" w:hAnsi="Arial"/>
+                <w:b/>
+                <w:bCs/>
+                <w:sz w:val="18"/>
+                <w:szCs w:val="18"/>
+              </w:rPr>
+              <w:t xml:space="preserve">Retenção INSS (11%)</w:t>
+            </w:r>
+          </w:p>
+        </w:tc>
+        <w:tc>
+          <w:tcPr>
+            <w:tcW w:type="dxa" w:w="2819"/>
+            <w:tcBorders>
+              <w:top w:val="single" w:color="9AA8B8" w:sz="4"/>
+              <w:left w:val="single" w:color="9AA8B8" w:sz="4"/>
+              <w:bottom w:val="single" w:color="9AA8B8" w:sz="4"/>
+              <w:right w:val="single" w:color="9AA8B8" w:sz="4"/>
+            </w:tcBorders>
+            <w:tcMar>
+              <w:top w:type="dxa" w:w="35"/>
+              <w:left w:type="dxa" w:w="90"/>
+              <w:bottom w:type="dxa" w:w="35"/>
+              <w:right w:type="dxa" w:w="90"/>
+            </w:tcMar>
+          </w:tcPr>
+          <w:p>
+            <w:pPr>
+              <w:jc w:val="left"/>
+            </w:pPr>
+            <w:r>
+              <w:rPr>
+                <w:rFonts w:ascii="Arial" w:cs="Arial" w:eastAsia="Arial" w:hAnsi="Arial"/>
+                <w:b w:val="false"/>
+                <w:bCs w:val="false"/>
+                <w:sz w:val="18"/>
+                <w:szCs w:val="18"/>
+              </w:rPr>
+              <w:t xml:space="preserve">R$ 1.320,00 – credor INSS, CNPJ 29.979.036/0001-40</w:t>
+            </w:r>
+          </w:p>
+        </w:tc>
+      </w:tr>
+      <w:tr>
+        <w:tc>
+          <w:tcPr>
+            <w:tcW w:type="dxa" w:w="2000"/>
+            <w:tcBorders>
+              <w:top w:val="single" w:color="9AA8B8" w:sz="4"/>
+              <w:left w:val="single" w:color="9AA8B8" w:sz="4"/>
+              <w:bottom w:val="single" w:color="9AA8B8" w:sz="4"/>
+              <w:right w:val="single" w:color="9AA8B8" w:sz="4"/>
+            </w:tcBorders>
+            <w:shd w:fill="E8EDF3" w:color="auto" w:val="clear"/>
+            <w:tcMar>
+              <w:top w:type="dxa" w:w="35"/>
+              <w:left w:type="dxa" w:w="90"/>
+              <w:bottom w:type="dxa" w:w="35"/>
+              <w:right w:type="dxa" w:w="90"/>
+            </w:tcMar>
+          </w:tcPr>
+          <w:p>
+            <w:pPr>
+              <w:jc w:val="left"/>
+            </w:pPr>
+            <w:r>
+              <w:rPr>
+                <w:rFonts w:ascii="Arial" w:cs="Arial" w:eastAsia="Arial" w:hAnsi="Arial"/>
+                <w:b/>
+                <w:bCs/>
+                <w:sz w:val="18"/>
+                <w:szCs w:val="18"/>
+              </w:rPr>
+              <w:t xml:space="preserve">Retenção ISS (5%)</w:t>
+            </w:r>
+          </w:p>
+        </w:tc>
+        <w:tc>
+          <w:tcPr>
+            <w:tcW w:type="dxa" w:w="7638"/>
+            <w:gridSpan w:val="3"/>
+            <w:tcBorders>
+              <w:top w:val="single" w:color="9AA8B8" w:sz="4"/>
+              <w:left w:val="single" w:color="9AA8B8" w:sz="4"/>
+              <w:bottom w:val="single" w:color="9AA8B8" w:sz="4"/>
+              <w:right w:val="single" w:color="9AA8B8" w:sz="4"/>
+            </w:tcBorders>
+            <w:tcMar>
+              <w:top w:type="dxa" w:w="35"/>
+              <w:left w:type="dxa" w:w="90"/>
+              <w:bottom w:type="dxa" w:w="35"/>
+              <w:right w:type="dxa" w:w="90"/>
+            </w:tcMar>
+          </w:tcPr>
+          <w:p>
+            <w:pPr>
+              <w:jc w:val="left"/>
+            </w:pPr>
+            <w:r>
+              <w:rPr>
+                <w:rFonts w:ascii="Arial" w:cs="Arial" w:eastAsia="Arial" w:hAnsi="Arial"/>
+                <w:b w:val="false"/>
+                <w:bCs w:val="false"/>
+                <w:sz w:val="18"/>
+                <w:szCs w:val="18"/>
+              </w:rPr>
+              <w:t xml:space="preserve">R$ 600,00 – credor Município de Belo Horizonte, CNPJ 18.715.383/0001-40</w:t>
             </w:r>
           </w:p>
         </w:tc>
@@ -3628,7 +3960,7 @@
                 <w:sz w:val="18"/>
                 <w:szCs w:val="18"/>
               </w:rPr>
-              <w:t xml:space="preserve">Processo SIAD</w:t>
+              <w:t xml:space="preserve">Processo SIAD (Un/Seq/Ano)</w:t>
             </w:r>
           </w:p>
         </w:tc>
@@ -3660,7 +3992,7 @@
                 <w:sz w:val="18"/>
                 <w:szCs w:val="18"/>
               </w:rPr>
-              <w:t xml:space="preserve">50057/300/2026</w:t>
+              <w:t xml:space="preserve">1250057 300 2026</w:t>
             </w:r>
           </w:p>
         </w:tc>
@@ -4605,7 +4937,7 @@
                 <w:sz w:val="18"/>
                 <w:szCs w:val="18"/>
               </w:rPr>
-              <w:t xml:space="preserve">50057</w:t>
+              <w:t xml:space="preserve">1250057</w:t>
             </w:r>
           </w:p>
         </w:tc>
@@ -4672,7 +5004,7 @@
                 <w:sz w:val="18"/>
                 <w:szCs w:val="18"/>
               </w:rPr>
-              <w:t xml:space="preserve">06.181.701.2001</w:t>
+              <w:t xml:space="preserve">06 181 701 2001 0001</w:t>
             </w:r>
           </w:p>
         </w:tc>
@@ -4705,7 +5037,7 @@
                 <w:sz w:val="18"/>
                 <w:szCs w:val="18"/>
               </w:rPr>
-              <w:t xml:space="preserve">Fonte</w:t>
+              <w:t xml:space="preserve">Fonte / Proc. / IPE</w:t>
             </w:r>
           </w:p>
         </w:tc>
@@ -4737,7 +5069,7 @@
                 <w:sz w:val="18"/>
                 <w:szCs w:val="18"/>
               </w:rPr>
-              <w:t xml:space="preserve">6020</w:t>
+              <w:t xml:space="preserve">6020 / 1 / 0</w:t>
             </w:r>
           </w:p>
         </w:tc>
@@ -6801,7 +7133,207 @@
                 <w:sz w:val="18"/>
                 <w:szCs w:val="18"/>
               </w:rPr>
-              <w:t xml:space="preserve">S</w:t>
+              <w:t xml:space="preserve">N</w:t>
+            </w:r>
+          </w:p>
+        </w:tc>
+      </w:tr>
+      <w:tr>
+        <w:tc>
+          <w:tcPr>
+            <w:tcW w:type="dxa" w:w="2000"/>
+            <w:tcBorders>
+              <w:top w:val="single" w:color="9AA8B8" w:sz="4"/>
+              <w:left w:val="single" w:color="9AA8B8" w:sz="4"/>
+              <w:bottom w:val="single" w:color="9AA8B8" w:sz="4"/>
+              <w:right w:val="single" w:color="9AA8B8" w:sz="4"/>
+            </w:tcBorders>
+            <w:shd w:fill="E8EDF3" w:color="auto" w:val="clear"/>
+            <w:tcMar>
+              <w:top w:type="dxa" w:w="35"/>
+              <w:left w:type="dxa" w:w="90"/>
+              <w:bottom w:type="dxa" w:w="35"/>
+              <w:right w:type="dxa" w:w="90"/>
+            </w:tcMar>
+          </w:tcPr>
+          <w:p>
+            <w:pPr>
+              <w:jc w:val="left"/>
+            </w:pPr>
+            <w:r>
+              <w:rPr>
+                <w:rFonts w:ascii="Arial" w:cs="Arial" w:eastAsia="Arial" w:hAnsi="Arial"/>
+                <w:b/>
+                <w:bCs/>
+                <w:sz w:val="18"/>
+                <w:szCs w:val="18"/>
+              </w:rPr>
+              <w:t xml:space="preserve">Conformidade de liquidação</w:t>
+            </w:r>
+          </w:p>
+        </w:tc>
+        <w:tc>
+          <w:tcPr>
+            <w:tcW w:type="dxa" w:w="2819"/>
+            <w:tcBorders>
+              <w:top w:val="single" w:color="9AA8B8" w:sz="4"/>
+              <w:left w:val="single" w:color="9AA8B8" w:sz="4"/>
+              <w:bottom w:val="single" w:color="9AA8B8" w:sz="4"/>
+              <w:right w:val="single" w:color="9AA8B8" w:sz="4"/>
+            </w:tcBorders>
+            <w:tcMar>
+              <w:top w:type="dxa" w:w="35"/>
+              <w:left w:type="dxa" w:w="90"/>
+              <w:bottom w:type="dxa" w:w="35"/>
+              <w:right w:type="dxa" w:w="90"/>
+            </w:tcMar>
+          </w:tcPr>
+          <w:p>
+            <w:pPr>
+              <w:jc w:val="left"/>
+            </w:pPr>
+            <w:r>
+              <w:rPr>
+                <w:rFonts w:ascii="Arial" w:cs="Arial" w:eastAsia="Arial" w:hAnsi="Arial"/>
+                <w:b w:val="false"/>
+                <w:bCs w:val="false"/>
+                <w:sz w:val="18"/>
+                <w:szCs w:val="18"/>
+              </w:rPr>
+              <w:t xml:space="preserve">1250057 502 2026</w:t>
+            </w:r>
+          </w:p>
+        </w:tc>
+        <w:tc>
+          <w:tcPr>
+            <w:tcW w:type="dxa" w:w="2000"/>
+            <w:tcBorders>
+              <w:top w:val="single" w:color="9AA8B8" w:sz="4"/>
+              <w:left w:val="single" w:color="9AA8B8" w:sz="4"/>
+              <w:bottom w:val="single" w:color="9AA8B8" w:sz="4"/>
+              <w:right w:val="single" w:color="9AA8B8" w:sz="4"/>
+            </w:tcBorders>
+            <w:shd w:fill="E8EDF3" w:color="auto" w:val="clear"/>
+            <w:tcMar>
+              <w:top w:type="dxa" w:w="35"/>
+              <w:left w:type="dxa" w:w="90"/>
+              <w:bottom w:type="dxa" w:w="35"/>
+              <w:right w:type="dxa" w:w="90"/>
+            </w:tcMar>
+          </w:tcPr>
+          <w:p>
+            <w:pPr>
+              <w:jc w:val="left"/>
+            </w:pPr>
+            <w:r>
+              <w:rPr>
+                <w:rFonts w:ascii="Arial" w:cs="Arial" w:eastAsia="Arial" w:hAnsi="Arial"/>
+                <w:b/>
+                <w:bCs/>
+                <w:sz w:val="18"/>
+                <w:szCs w:val="18"/>
+              </w:rPr>
+              <w:t xml:space="preserve">Nr. Conf. SIAD</w:t>
+            </w:r>
+          </w:p>
+        </w:tc>
+        <w:tc>
+          <w:tcPr>
+            <w:tcW w:type="dxa" w:w="2819"/>
+            <w:tcBorders>
+              <w:top w:val="single" w:color="9AA8B8" w:sz="4"/>
+              <w:left w:val="single" w:color="9AA8B8" w:sz="4"/>
+              <w:bottom w:val="single" w:color="9AA8B8" w:sz="4"/>
+              <w:right w:val="single" w:color="9AA8B8" w:sz="4"/>
+            </w:tcBorders>
+            <w:tcMar>
+              <w:top w:type="dxa" w:w="35"/>
+              <w:left w:type="dxa" w:w="90"/>
+              <w:bottom w:type="dxa" w:w="35"/>
+              <w:right w:type="dxa" w:w="90"/>
+            </w:tcMar>
+          </w:tcPr>
+          <w:p>
+            <w:pPr>
+              <w:jc w:val="left"/>
+            </w:pPr>
+            <w:r>
+              <w:rPr>
+                <w:rFonts w:ascii="Arial" w:cs="Arial" w:eastAsia="Arial" w:hAnsi="Arial"/>
+                <w:b w:val="false"/>
+                <w:bCs w:val="false"/>
+                <w:sz w:val="18"/>
+                <w:szCs w:val="18"/>
+              </w:rPr>
+              <w:t xml:space="preserve">2</w:t>
+            </w:r>
+          </w:p>
+        </w:tc>
+      </w:tr>
+      <w:tr>
+        <w:tc>
+          <w:tcPr>
+            <w:tcW w:type="dxa" w:w="2000"/>
+            <w:tcBorders>
+              <w:top w:val="single" w:color="9AA8B8" w:sz="4"/>
+              <w:left w:val="single" w:color="9AA8B8" w:sz="4"/>
+              <w:bottom w:val="single" w:color="9AA8B8" w:sz="4"/>
+              <w:right w:val="single" w:color="9AA8B8" w:sz="4"/>
+            </w:tcBorders>
+            <w:shd w:fill="E8EDF3" w:color="auto" w:val="clear"/>
+            <w:tcMar>
+              <w:top w:type="dxa" w:w="35"/>
+              <w:left w:type="dxa" w:w="90"/>
+              <w:bottom w:type="dxa" w:w="35"/>
+              <w:right w:type="dxa" w:w="90"/>
+            </w:tcMar>
+          </w:tcPr>
+          <w:p>
+            <w:pPr>
+              <w:jc w:val="left"/>
+            </w:pPr>
+            <w:r>
+              <w:rPr>
+                <w:rFonts w:ascii="Arial" w:cs="Arial" w:eastAsia="Arial" w:hAnsi="Arial"/>
+                <w:b/>
+                <w:bCs/>
+                <w:sz w:val="18"/>
+                <w:szCs w:val="18"/>
+              </w:rPr>
+              <w:t xml:space="preserve">Competência</w:t>
+            </w:r>
+          </w:p>
+        </w:tc>
+        <w:tc>
+          <w:tcPr>
+            <w:tcW w:type="dxa" w:w="7638"/>
+            <w:gridSpan w:val="3"/>
+            <w:tcBorders>
+              <w:top w:val="single" w:color="9AA8B8" w:sz="4"/>
+              <w:left w:val="single" w:color="9AA8B8" w:sz="4"/>
+              <w:bottom w:val="single" w:color="9AA8B8" w:sz="4"/>
+              <w:right w:val="single" w:color="9AA8B8" w:sz="4"/>
+            </w:tcBorders>
+            <w:tcMar>
+              <w:top w:type="dxa" w:w="35"/>
+              <w:left w:type="dxa" w:w="90"/>
+              <w:bottom w:type="dxa" w:w="35"/>
+              <w:right w:type="dxa" w:w="90"/>
+            </w:tcMar>
+          </w:tcPr>
+          <w:p>
+            <w:pPr>
+              <w:jc w:val="left"/>
+            </w:pPr>
+            <w:r>
+              <w:rPr>
+                <w:rFonts w:ascii="Arial" w:cs="Arial" w:eastAsia="Arial" w:hAnsi="Arial"/>
+                <w:b w:val="false"/>
+                <w:bCs w:val="false"/>
+                <w:sz w:val="18"/>
+                <w:szCs w:val="18"/>
+              </w:rPr>
+              <w:t xml:space="preserve">2026 / 10</w:t>
             </w:r>
           </w:p>
         </w:tc>

</xml_diff>